<commit_message>
Doc. Sprint 5 finita
</commit_message>
<xml_diff>
--- a/3_Documentazione/Documentazione-Sprint5.docx
+++ b/3_Documentazione/Documentazione-Sprint5.docx
@@ -576,7 +576,9 @@
               <w:tab w:val="right" w:leader="dot" w:pos="9628"/>
             </w:tabs>
             <w:rPr>
+              <w:rFonts w:eastAsiaTheme="minorEastAsia"/>
               <w:noProof/>
+              <w:lang w:eastAsia="it-CH"/>
             </w:rPr>
           </w:pPr>
           <w:r>
@@ -588,7 +590,7 @@
           <w:r>
             <w:fldChar w:fldCharType="separate"/>
           </w:r>
-          <w:hyperlink w:anchor="_Toc198733489" w:history="1">
+          <w:hyperlink w:anchor="_Toc199335536" w:history="1">
             <w:r>
               <w:rPr>
                 <w:rStyle w:val="Collegamentoipertestuale"/>
@@ -615,7 +617,7 @@
                 <w:noProof/>
                 <w:webHidden/>
               </w:rPr>
-              <w:instrText xml:space="preserve"> PAGEREF _Toc198733489 \h </w:instrText>
+              <w:instrText xml:space="preserve"> PAGEREF _Toc199335536 \h </w:instrText>
             </w:r>
             <w:r>
               <w:rPr>
@@ -636,6 +638,289 @@
                 <w:webHidden/>
               </w:rPr>
               <w:t>2</w:t>
+            </w:r>
+            <w:r>
+              <w:rPr>
+                <w:noProof/>
+                <w:webHidden/>
+              </w:rPr>
+              <w:fldChar w:fldCharType="end"/>
+            </w:r>
+          </w:hyperlink>
+        </w:p>
+        <w:p>
+          <w:pPr>
+            <w:pStyle w:val="Sommario1"/>
+            <w:tabs>
+              <w:tab w:val="right" w:leader="dot" w:pos="9628"/>
+            </w:tabs>
+            <w:rPr>
+              <w:rFonts w:eastAsiaTheme="minorEastAsia"/>
+              <w:noProof/>
+              <w:lang w:eastAsia="it-CH"/>
+            </w:rPr>
+          </w:pPr>
+          <w:hyperlink w:anchor="_Toc199335537" w:history="1">
+            <w:r>
+              <w:rPr>
+                <w:rStyle w:val="Collegamentoipertestuale"/>
+                <w:noProof/>
+              </w:rPr>
+              <w:t>Deploy</w:t>
+            </w:r>
+            <w:r>
+              <w:rPr>
+                <w:noProof/>
+                <w:webHidden/>
+              </w:rPr>
+              <w:tab/>
+            </w:r>
+            <w:r>
+              <w:rPr>
+                <w:noProof/>
+                <w:webHidden/>
+              </w:rPr>
+              <w:fldChar w:fldCharType="begin"/>
+            </w:r>
+            <w:r>
+              <w:rPr>
+                <w:noProof/>
+                <w:webHidden/>
+              </w:rPr>
+              <w:instrText xml:space="preserve"> PAGEREF _Toc199335537 \h </w:instrText>
+            </w:r>
+            <w:r>
+              <w:rPr>
+                <w:noProof/>
+                <w:webHidden/>
+              </w:rPr>
+            </w:r>
+            <w:r>
+              <w:rPr>
+                <w:noProof/>
+                <w:webHidden/>
+              </w:rPr>
+              <w:fldChar w:fldCharType="separate"/>
+            </w:r>
+            <w:r>
+              <w:rPr>
+                <w:noProof/>
+                <w:webHidden/>
+              </w:rPr>
+              <w:t>3</w:t>
+            </w:r>
+            <w:r>
+              <w:rPr>
+                <w:noProof/>
+                <w:webHidden/>
+              </w:rPr>
+              <w:fldChar w:fldCharType="end"/>
+            </w:r>
+          </w:hyperlink>
+        </w:p>
+        <w:p>
+          <w:pPr>
+            <w:pStyle w:val="Sommario1"/>
+            <w:tabs>
+              <w:tab w:val="right" w:leader="dot" w:pos="9628"/>
+            </w:tabs>
+            <w:rPr>
+              <w:rFonts w:eastAsiaTheme="minorEastAsia"/>
+              <w:noProof/>
+              <w:lang w:eastAsia="it-CH"/>
+            </w:rPr>
+          </w:pPr>
+          <w:hyperlink w:anchor="_Toc199335538" w:history="1">
+            <w:r>
+              <w:rPr>
+                <w:rStyle w:val="Collegamentoipertestuale"/>
+                <w:noProof/>
+                <w:lang w:val="it-IT"/>
+              </w:rPr>
+              <w:t>Categorie Prodotto</w:t>
+            </w:r>
+            <w:r>
+              <w:rPr>
+                <w:noProof/>
+                <w:webHidden/>
+              </w:rPr>
+              <w:tab/>
+            </w:r>
+            <w:r>
+              <w:rPr>
+                <w:noProof/>
+                <w:webHidden/>
+              </w:rPr>
+              <w:fldChar w:fldCharType="begin"/>
+            </w:r>
+            <w:r>
+              <w:rPr>
+                <w:noProof/>
+                <w:webHidden/>
+              </w:rPr>
+              <w:instrText xml:space="preserve"> PAGEREF _Toc199335538 \h </w:instrText>
+            </w:r>
+            <w:r>
+              <w:rPr>
+                <w:noProof/>
+                <w:webHidden/>
+              </w:rPr>
+            </w:r>
+            <w:r>
+              <w:rPr>
+                <w:noProof/>
+                <w:webHidden/>
+              </w:rPr>
+              <w:fldChar w:fldCharType="separate"/>
+            </w:r>
+            <w:r>
+              <w:rPr>
+                <w:noProof/>
+                <w:webHidden/>
+              </w:rPr>
+              <w:t>3</w:t>
+            </w:r>
+            <w:r>
+              <w:rPr>
+                <w:noProof/>
+                <w:webHidden/>
+              </w:rPr>
+              <w:fldChar w:fldCharType="end"/>
+            </w:r>
+          </w:hyperlink>
+        </w:p>
+        <w:p>
+          <w:pPr>
+            <w:pStyle w:val="Sommario1"/>
+            <w:tabs>
+              <w:tab w:val="right" w:leader="dot" w:pos="9628"/>
+            </w:tabs>
+            <w:rPr>
+              <w:rFonts w:eastAsiaTheme="minorEastAsia"/>
+              <w:noProof/>
+              <w:lang w:eastAsia="it-CH"/>
+            </w:rPr>
+          </w:pPr>
+          <w:hyperlink w:anchor="_Toc199335539" w:history="1">
+            <w:r>
+              <w:rPr>
+                <w:rStyle w:val="Collegamentoipertestuale"/>
+                <w:noProof/>
+                <w:lang w:val="it-IT"/>
+              </w:rPr>
+              <w:t>Pagina ordini (utente)</w:t>
+            </w:r>
+            <w:r>
+              <w:rPr>
+                <w:noProof/>
+                <w:webHidden/>
+              </w:rPr>
+              <w:tab/>
+            </w:r>
+            <w:r>
+              <w:rPr>
+                <w:noProof/>
+                <w:webHidden/>
+              </w:rPr>
+              <w:fldChar w:fldCharType="begin"/>
+            </w:r>
+            <w:r>
+              <w:rPr>
+                <w:noProof/>
+                <w:webHidden/>
+              </w:rPr>
+              <w:instrText xml:space="preserve"> PAGEREF _Toc199335539 \h </w:instrText>
+            </w:r>
+            <w:r>
+              <w:rPr>
+                <w:noProof/>
+                <w:webHidden/>
+              </w:rPr>
+            </w:r>
+            <w:r>
+              <w:rPr>
+                <w:noProof/>
+                <w:webHidden/>
+              </w:rPr>
+              <w:fldChar w:fldCharType="separate"/>
+            </w:r>
+            <w:r>
+              <w:rPr>
+                <w:noProof/>
+                <w:webHidden/>
+              </w:rPr>
+              <w:t>4</w:t>
+            </w:r>
+            <w:r>
+              <w:rPr>
+                <w:noProof/>
+                <w:webHidden/>
+              </w:rPr>
+              <w:fldChar w:fldCharType="end"/>
+            </w:r>
+          </w:hyperlink>
+        </w:p>
+        <w:p>
+          <w:pPr>
+            <w:pStyle w:val="Sommario1"/>
+            <w:tabs>
+              <w:tab w:val="right" w:leader="dot" w:pos="9628"/>
+            </w:tabs>
+            <w:rPr>
+              <w:rFonts w:eastAsiaTheme="minorEastAsia"/>
+              <w:noProof/>
+              <w:lang w:eastAsia="it-CH"/>
+            </w:rPr>
+          </w:pPr>
+          <w:hyperlink w:anchor="_Toc199335540" w:history="1">
+            <w:r>
+              <w:rPr>
+                <w:rStyle w:val="Collegamentoipertestuale"/>
+                <w:noProof/>
+                <w:lang w:val="it-IT"/>
+              </w:rPr>
+              <w:t>Test</w:t>
+            </w:r>
+            <w:r>
+              <w:rPr>
+                <w:noProof/>
+                <w:webHidden/>
+              </w:rPr>
+              <w:tab/>
+            </w:r>
+            <w:r>
+              <w:rPr>
+                <w:noProof/>
+                <w:webHidden/>
+              </w:rPr>
+              <w:fldChar w:fldCharType="begin"/>
+            </w:r>
+            <w:r>
+              <w:rPr>
+                <w:noProof/>
+                <w:webHidden/>
+              </w:rPr>
+              <w:instrText xml:space="preserve"> PAGEREF _Toc199335540 \h </w:instrText>
+            </w:r>
+            <w:r>
+              <w:rPr>
+                <w:noProof/>
+                <w:webHidden/>
+              </w:rPr>
+            </w:r>
+            <w:r>
+              <w:rPr>
+                <w:noProof/>
+                <w:webHidden/>
+              </w:rPr>
+              <w:fldChar w:fldCharType="separate"/>
+            </w:r>
+            <w:r>
+              <w:rPr>
+                <w:noProof/>
+                <w:webHidden/>
+              </w:rPr>
+              <w:t>4</w:t>
             </w:r>
             <w:r>
               <w:rPr>
@@ -667,17 +952,15 @@
       <w:pPr>
         <w:pStyle w:val="Titolo1"/>
       </w:pPr>
-      <w:bookmarkStart w:id="0" w:name="_Toc198733489"/>
+      <w:bookmarkStart w:id="0" w:name="_Toc199335536"/>
       <w:r>
         <w:lastRenderedPageBreak/>
         <w:t>Filtri</w:t>
       </w:r>
+      <w:r>
+        <w:t xml:space="preserve"> di ricerca</w:t>
+      </w:r>
       <w:bookmarkEnd w:id="0"/>
-      <w:r>
-        <w:t xml:space="preserve"> di ricerca</w:t>
-      </w:r>
-      <w:bookmarkStart w:id="1" w:name="_GoBack"/>
-      <w:bookmarkEnd w:id="1"/>
     </w:p>
     <w:p>
       <w:r>
@@ -854,14 +1137,27 @@
       <w:r>
         <w:t xml:space="preserve">Figura </w:t>
       </w:r>
-      <w:fldSimple w:instr=" SEQ Figura \* ARABIC ">
-        <w:r>
-          <w:rPr>
-            <w:noProof/>
-          </w:rPr>
-          <w:t>1</w:t>
-        </w:r>
-      </w:fldSimple>
+      <w:r>
+        <w:fldChar w:fldCharType="begin"/>
+      </w:r>
+      <w:r>
+        <w:instrText xml:space="preserve"> SEQ Figura \* ARABIC </w:instrText>
+      </w:r>
+      <w:r>
+        <w:fldChar w:fldCharType="separate"/>
+      </w:r>
+      <w:r>
+        <w:rPr>
+          <w:noProof/>
+        </w:rPr>
+        <w:t>1</w:t>
+      </w:r>
+      <w:r>
+        <w:rPr>
+          <w:noProof/>
+        </w:rPr>
+        <w:fldChar w:fldCharType="end"/>
+      </w:r>
       <w:r>
         <w:t>: Filtri di ricerca</w:t>
       </w:r>
@@ -938,66 +1234,566 @@
       <w:r>
         <w:t xml:space="preserve">Figura </w:t>
       </w:r>
+      <w:r>
+        <w:fldChar w:fldCharType="begin"/>
+      </w:r>
+      <w:r>
+        <w:instrText xml:space="preserve"> SEQ Figura \* ARABIC </w:instrText>
+      </w:r>
+      <w:r>
+        <w:fldChar w:fldCharType="separate"/>
+      </w:r>
+      <w:r>
+        <w:rPr>
+          <w:noProof/>
+        </w:rPr>
+        <w:t>2</w:t>
+      </w:r>
+      <w:r>
+        <w:rPr>
+          <w:noProof/>
+        </w:rPr>
+        <w:fldChar w:fldCharType="end"/>
+      </w:r>
+      <w:r>
+        <w:t>: Filtri di ricerca nella searchbar</w:t>
+      </w:r>
+    </w:p>
+    <w:p>
+      <w:r>
+        <w:br w:type="page"/>
+      </w:r>
+    </w:p>
+    <w:p>
+      <w:pPr>
+        <w:pStyle w:val="Titolo1"/>
+      </w:pPr>
+      <w:bookmarkStart w:id="1" w:name="_Toc199335537"/>
+      <w:r>
+        <w:lastRenderedPageBreak/>
+        <w:t>Deploy</w:t>
+      </w:r>
+      <w:bookmarkEnd w:id="1"/>
+    </w:p>
+    <w:p>
+      <w:pPr>
+        <w:rPr>
+          <w:lang w:val="it-IT"/>
+        </w:rPr>
+      </w:pPr>
+      <w:r>
+        <w:rPr>
+          <w:lang w:val="it-IT"/>
+        </w:rPr>
+        <w:t xml:space="preserve">Il server dove abbiamo fatto il deploy dell’applicativo ci è stato fornito dalla scuola. Se il progetto viene scaricato da </w:t>
+      </w:r>
+      <w:proofErr w:type="spellStart"/>
+      <w:r>
+        <w:rPr>
+          <w:lang w:val="it-IT"/>
+        </w:rPr>
+        <w:t>github</w:t>
+      </w:r>
+      <w:proofErr w:type="spellEnd"/>
+      <w:r>
+        <w:rPr>
+          <w:lang w:val="it-IT"/>
+        </w:rPr>
+        <w:t xml:space="preserve"> tutti i moduli necessari non vengono scaricati quindi si dovrà eseguire il comando</w:t>
+      </w:r>
+      <w:r>
+        <w:rPr>
+          <w:lang w:val="it-IT"/>
+        </w:rPr>
+        <w:t xml:space="preserve"> </w:t>
+      </w:r>
+      <w:r>
+        <w:rPr>
+          <w:lang w:val="it-IT"/>
+        </w:rPr>
+        <w:t>“</w:t>
+      </w:r>
+      <w:proofErr w:type="spellStart"/>
+      <w:r>
+        <w:rPr>
+          <w:lang w:val="it-IT"/>
+        </w:rPr>
+        <w:t>composer</w:t>
+      </w:r>
+      <w:proofErr w:type="spellEnd"/>
+      <w:r>
+        <w:rPr>
+          <w:lang w:val="it-IT"/>
+        </w:rPr>
+        <w:t xml:space="preserve"> </w:t>
+      </w:r>
+      <w:proofErr w:type="spellStart"/>
+      <w:r>
+        <w:rPr>
+          <w:lang w:val="it-IT"/>
+        </w:rPr>
+        <w:t>install</w:t>
+      </w:r>
+      <w:proofErr w:type="spellEnd"/>
+      <w:r>
+        <w:rPr>
+          <w:lang w:val="it-IT"/>
+        </w:rPr>
+        <w:t xml:space="preserve">”. Il deploy è stato abbastanza semplice, tramite </w:t>
+      </w:r>
+      <w:proofErr w:type="spellStart"/>
+      <w:r>
+        <w:rPr>
+          <w:lang w:val="it-IT"/>
+        </w:rPr>
+        <w:t>filezilla</w:t>
+      </w:r>
+      <w:proofErr w:type="spellEnd"/>
+      <w:r>
+        <w:rPr>
+          <w:lang w:val="it-IT"/>
+        </w:rPr>
+        <w:t xml:space="preserve"> abbiamo fatto la connessione e successivamente abbiamo copiato tutto il progetto all’interno della cartella html. Il sito web è consultabile dal dominio </w:t>
+      </w:r>
+      <w:hyperlink r:id="rId11" w:history="1">
+        <w:proofErr w:type="spellStart"/>
+        <w:proofErr w:type="gramStart"/>
+        <w:r>
+          <w:rPr>
+            <w:rStyle w:val="Collegamentoipertestuale"/>
+            <w:lang w:val="it-IT"/>
+          </w:rPr>
+          <w:t>fyt.labosam.cpt.local</w:t>
+        </w:r>
+        <w:proofErr w:type="spellEnd"/>
+        <w:proofErr w:type="gramEnd"/>
+      </w:hyperlink>
+      <w:r>
+        <w:rPr>
+          <w:lang w:val="it-IT"/>
+        </w:rPr>
+        <w:t>.</w:t>
+      </w:r>
+    </w:p>
+    <w:p>
+      <w:pPr>
+        <w:rPr>
+          <w:lang w:val="it-IT"/>
+        </w:rPr>
+      </w:pPr>
+      <w:bookmarkStart w:id="2" w:name="_GoBack"/>
+      <w:bookmarkEnd w:id="2"/>
+    </w:p>
+    <w:p>
+      <w:pPr>
+        <w:pStyle w:val="Titolo1"/>
+        <w:rPr>
+          <w:lang w:val="it-IT"/>
+        </w:rPr>
+      </w:pPr>
+      <w:bookmarkStart w:id="3" w:name="_Toc199335538"/>
+      <w:r>
+        <w:rPr>
+          <w:lang w:val="it-IT"/>
+        </w:rPr>
+        <w:t>Categorie Prodotto</w:t>
+      </w:r>
+      <w:bookmarkEnd w:id="3"/>
+    </w:p>
+    <w:p>
+      <w:pPr>
+        <w:rPr>
+          <w:lang w:val="it-IT"/>
+        </w:rPr>
+      </w:pPr>
+      <w:r>
+        <w:rPr>
+          <w:lang w:val="it-IT"/>
+        </w:rPr>
+        <w:t>Nella pagina Home, sono state aggiunte due sezioni per le categorie del prodotto, ovvero “</w:t>
+      </w:r>
+      <w:proofErr w:type="spellStart"/>
+      <w:r>
+        <w:rPr>
+          <w:lang w:val="it-IT"/>
+        </w:rPr>
+        <w:t>Highlighted</w:t>
+      </w:r>
+      <w:proofErr w:type="spellEnd"/>
+      <w:r>
+        <w:rPr>
+          <w:lang w:val="it-IT"/>
+        </w:rPr>
+        <w:t>” per i prodotti in evidenza e “Best Sellers” per i prodotti più venduti.</w:t>
+      </w:r>
+    </w:p>
+    <w:p>
+      <w:pPr>
+        <w:keepNext/>
+        <w:jc w:val="center"/>
+      </w:pPr>
+      <w:r>
+        <w:rPr>
+          <w:noProof/>
+        </w:rPr>
+        <w:drawing>
+          <wp:inline distT="0" distB="0" distL="0" distR="0" wp14:anchorId="5C623D49" wp14:editId="2A734A3C">
+            <wp:extent cx="6183404" cy="1526367"/>
+            <wp:effectExtent l="114300" t="95250" r="103505" b="93345"/>
+            <wp:docPr id="2" name="Immagine 2"/>
+            <wp:cNvGraphicFramePr>
+              <a:graphicFrameLocks xmlns:a="http://schemas.openxmlformats.org/drawingml/2006/main" noChangeAspect="1"/>
+            </wp:cNvGraphicFramePr>
+            <a:graphic xmlns:a="http://schemas.openxmlformats.org/drawingml/2006/main">
+              <a:graphicData uri="http://schemas.openxmlformats.org/drawingml/2006/picture">
+                <pic:pic xmlns:pic="http://schemas.openxmlformats.org/drawingml/2006/picture">
+                  <pic:nvPicPr>
+                    <pic:cNvPr id="1" name=""/>
+                    <pic:cNvPicPr/>
+                  </pic:nvPicPr>
+                  <pic:blipFill>
+                    <a:blip r:embed="rId12"/>
+                    <a:stretch>
+                      <a:fillRect/>
+                    </a:stretch>
+                  </pic:blipFill>
+                  <pic:spPr>
+                    <a:xfrm>
+                      <a:off x="0" y="0"/>
+                      <a:ext cx="6261966" cy="1545760"/>
+                    </a:xfrm>
+                    <a:prstGeom prst="rect">
+                      <a:avLst/>
+                    </a:prstGeom>
+                    <a:effectLst>
+                      <a:outerShdw blurRad="63500" sx="102000" sy="102000" algn="ctr" rotWithShape="0">
+                        <a:prstClr val="black">
+                          <a:alpha val="40000"/>
+                        </a:prstClr>
+                      </a:outerShdw>
+                    </a:effectLst>
+                  </pic:spPr>
+                </pic:pic>
+              </a:graphicData>
+            </a:graphic>
+          </wp:inline>
+        </w:drawing>
+      </w:r>
+    </w:p>
+    <w:p>
+      <w:pPr>
+        <w:pStyle w:val="Didascalia"/>
+        <w:jc w:val="center"/>
+        <w:rPr>
+          <w:lang w:val="it-IT"/>
+        </w:rPr>
+      </w:pPr>
+      <w:r>
+        <w:t xml:space="preserve">Figura </w:t>
+      </w:r>
       <w:fldSimple w:instr=" SEQ Figura \* ARABIC ">
         <w:r>
           <w:rPr>
             <w:noProof/>
           </w:rPr>
-          <w:t>2</w:t>
+          <w:t>3</w:t>
         </w:r>
       </w:fldSimple>
       <w:r>
-        <w:t>: Filtri di ricerca nella searchbar</w:t>
-      </w:r>
-    </w:p>
-    <w:p>
-      <w:r>
+        <w:t xml:space="preserve"> - Sezione </w:t>
+      </w:r>
+      <w:proofErr w:type="spellStart"/>
+      <w:r>
+        <w:t>Highlighted</w:t>
+      </w:r>
+      <w:proofErr w:type="spellEnd"/>
+    </w:p>
+    <w:p>
+      <w:pPr>
+        <w:jc w:val="center"/>
+        <w:rPr>
+          <w:lang w:val="it-IT"/>
+        </w:rPr>
+      </w:pPr>
+    </w:p>
+    <w:p>
+      <w:pPr>
+        <w:keepNext/>
+      </w:pPr>
+      <w:r>
+        <w:rPr>
+          <w:noProof/>
+        </w:rPr>
+        <w:drawing>
+          <wp:inline distT="0" distB="0" distL="0" distR="0" wp14:anchorId="40EF91A8" wp14:editId="10AFAD7C">
+            <wp:extent cx="6120130" cy="2038350"/>
+            <wp:effectExtent l="114300" t="95250" r="109220" b="95250"/>
+            <wp:docPr id="3" name="Immagine 3"/>
+            <wp:cNvGraphicFramePr>
+              <a:graphicFrameLocks xmlns:a="http://schemas.openxmlformats.org/drawingml/2006/main" noChangeAspect="1"/>
+            </wp:cNvGraphicFramePr>
+            <a:graphic xmlns:a="http://schemas.openxmlformats.org/drawingml/2006/main">
+              <a:graphicData uri="http://schemas.openxmlformats.org/drawingml/2006/picture">
+                <pic:pic xmlns:pic="http://schemas.openxmlformats.org/drawingml/2006/picture">
+                  <pic:nvPicPr>
+                    <pic:cNvPr id="1" name=""/>
+                    <pic:cNvPicPr/>
+                  </pic:nvPicPr>
+                  <pic:blipFill>
+                    <a:blip r:embed="rId13"/>
+                    <a:stretch>
+                      <a:fillRect/>
+                    </a:stretch>
+                  </pic:blipFill>
+                  <pic:spPr>
+                    <a:xfrm>
+                      <a:off x="0" y="0"/>
+                      <a:ext cx="6120130" cy="2038350"/>
+                    </a:xfrm>
+                    <a:prstGeom prst="rect">
+                      <a:avLst/>
+                    </a:prstGeom>
+                    <a:effectLst>
+                      <a:outerShdw blurRad="63500" sx="102000" sy="102000" algn="ctr" rotWithShape="0">
+                        <a:prstClr val="black">
+                          <a:alpha val="40000"/>
+                        </a:prstClr>
+                      </a:outerShdw>
+                    </a:effectLst>
+                  </pic:spPr>
+                </pic:pic>
+              </a:graphicData>
+            </a:graphic>
+          </wp:inline>
+        </w:drawing>
+      </w:r>
+    </w:p>
+    <w:p>
+      <w:pPr>
+        <w:pStyle w:val="Didascalia"/>
+        <w:jc w:val="center"/>
+        <w:rPr>
+          <w:lang w:val="it-IT"/>
+        </w:rPr>
+      </w:pPr>
+      <w:r>
+        <w:t xml:space="preserve">Figura </w:t>
+      </w:r>
+      <w:fldSimple w:instr=" SEQ Figura \* ARABIC ">
+        <w:r>
+          <w:rPr>
+            <w:noProof/>
+          </w:rPr>
+          <w:t>4</w:t>
+        </w:r>
+      </w:fldSimple>
+      <w:r>
+        <w:t xml:space="preserve"> - Sezione Best Sellers</w:t>
+      </w:r>
+    </w:p>
+    <w:p>
+      <w:pPr>
+        <w:rPr>
+          <w:lang w:val="it-IT"/>
+        </w:rPr>
+      </w:pPr>
+    </w:p>
+    <w:p>
+      <w:pPr>
+        <w:rPr>
+          <w:rFonts w:asciiTheme="majorHAnsi" w:eastAsiaTheme="majorEastAsia" w:hAnsiTheme="majorHAnsi" w:cstheme="majorBidi"/>
+          <w:color w:val="2F5496" w:themeColor="accent1" w:themeShade="BF"/>
+          <w:sz w:val="32"/>
+          <w:szCs w:val="32"/>
+          <w:lang w:val="it-IT"/>
+        </w:rPr>
+      </w:pPr>
+      <w:r>
+        <w:rPr>
+          <w:lang w:val="it-IT"/>
+        </w:rPr>
         <w:br w:type="page"/>
       </w:r>
     </w:p>
     <w:p>
       <w:pPr>
         <w:pStyle w:val="Titolo1"/>
-      </w:pPr>
-      <w:r>
+        <w:rPr>
+          <w:lang w:val="it-IT"/>
+        </w:rPr>
+      </w:pPr>
+      <w:bookmarkStart w:id="4" w:name="_Toc199335539"/>
+      <w:r>
+        <w:rPr>
+          <w:lang w:val="it-IT"/>
+        </w:rPr>
         <w:lastRenderedPageBreak/>
-        <w:t>Deploy</w:t>
-      </w:r>
-    </w:p>
-    <w:p>
-      <w:r>
-        <w:t xml:space="preserve">È stato effettuato il deploy dell’applicativo sul Server dedicato, che è accessibile solamente dalla rete grigia. Nel </w:t>
-      </w:r>
-      <w:proofErr w:type="gramStart"/>
-      <w:r>
-        <w:t xml:space="preserve">file </w:t>
-      </w:r>
-      <w:r>
-        <w:rPr>
-          <w:b/>
-        </w:rPr>
-        <w:t>.env</w:t>
-      </w:r>
-      <w:proofErr w:type="gramEnd"/>
-      <w:r>
-        <w:t xml:space="preserve"> sono state cambiate alcune configurazioni, come … </w:t>
-      </w:r>
-    </w:p>
-    <w:p>
-      <w:r>
-        <w:t>Il sito è dunque raggiungibile al seguente indirizzo</w:t>
-      </w:r>
-      <w:r>
-        <w:t>: fyt</w:t>
-      </w:r>
-      <w:r>
-        <w:t>.labosam.cpt.local</w:t>
-      </w:r>
-    </w:p>
-    <w:p/>
+        <w:t>Pagina ordini (utente)</w:t>
+      </w:r>
+      <w:bookmarkEnd w:id="4"/>
+    </w:p>
+    <w:p>
+      <w:pPr>
+        <w:rPr>
+          <w:lang w:val="it-IT"/>
+        </w:rPr>
+      </w:pPr>
+      <w:r>
+        <w:rPr>
+          <w:lang w:val="it-IT"/>
+        </w:rPr>
+        <w:t>Se si clicca sul proprio profilo in alto a destra della pagina, e si seleziona l’opzione “</w:t>
+      </w:r>
+      <w:proofErr w:type="spellStart"/>
+      <w:r>
+        <w:rPr>
+          <w:lang w:val="it-IT"/>
+        </w:rPr>
+        <w:t>Orders</w:t>
+      </w:r>
+      <w:proofErr w:type="spellEnd"/>
+      <w:r>
+        <w:rPr>
+          <w:lang w:val="it-IT"/>
+        </w:rPr>
+        <w:t>”</w:t>
+      </w:r>
+      <w:r>
+        <w:rPr>
+          <w:lang w:val="it-IT"/>
+        </w:rPr>
+        <w:t xml:space="preserve"> si apre una pagina in cui vengono visualizzati gli ordini effettuati. Se non è stato effettuato alcun ordine, si potrà cliccare sul pulsante “</w:t>
+      </w:r>
+      <w:proofErr w:type="spellStart"/>
+      <w:r>
+        <w:rPr>
+          <w:lang w:val="it-IT"/>
+        </w:rPr>
+        <w:t>Browse</w:t>
+      </w:r>
+      <w:proofErr w:type="spellEnd"/>
+      <w:r>
+        <w:rPr>
+          <w:lang w:val="it-IT"/>
+        </w:rPr>
+        <w:t xml:space="preserve"> Products” per esplorare il catalogo dei prodotti.</w:t>
+      </w:r>
+    </w:p>
+    <w:p>
+      <w:pPr>
+        <w:keepNext/>
+        <w:jc w:val="center"/>
+      </w:pPr>
+      <w:r>
+        <w:rPr>
+          <w:noProof/>
+        </w:rPr>
+        <w:drawing>
+          <wp:inline distT="0" distB="0" distL="0" distR="0" wp14:anchorId="67DAE9C9" wp14:editId="3D2ECFCA">
+            <wp:extent cx="3448050" cy="2438400"/>
+            <wp:effectExtent l="95250" t="95250" r="95250" b="95250"/>
+            <wp:docPr id="6" name="Immagine 6"/>
+            <wp:cNvGraphicFramePr>
+              <a:graphicFrameLocks xmlns:a="http://schemas.openxmlformats.org/drawingml/2006/main" noChangeAspect="1"/>
+            </wp:cNvGraphicFramePr>
+            <a:graphic xmlns:a="http://schemas.openxmlformats.org/drawingml/2006/main">
+              <a:graphicData uri="http://schemas.openxmlformats.org/drawingml/2006/picture">
+                <pic:pic xmlns:pic="http://schemas.openxmlformats.org/drawingml/2006/picture">
+                  <pic:nvPicPr>
+                    <pic:cNvPr id="1" name=""/>
+                    <pic:cNvPicPr/>
+                  </pic:nvPicPr>
+                  <pic:blipFill>
+                    <a:blip r:embed="rId14"/>
+                    <a:stretch>
+                      <a:fillRect/>
+                    </a:stretch>
+                  </pic:blipFill>
+                  <pic:spPr>
+                    <a:xfrm>
+                      <a:off x="0" y="0"/>
+                      <a:ext cx="3448050" cy="2438400"/>
+                    </a:xfrm>
+                    <a:prstGeom prst="rect">
+                      <a:avLst/>
+                    </a:prstGeom>
+                    <a:effectLst>
+                      <a:outerShdw blurRad="63500" sx="102000" sy="102000" algn="ctr" rotWithShape="0">
+                        <a:prstClr val="black">
+                          <a:alpha val="40000"/>
+                        </a:prstClr>
+                      </a:outerShdw>
+                    </a:effectLst>
+                  </pic:spPr>
+                </pic:pic>
+              </a:graphicData>
+            </a:graphic>
+          </wp:inline>
+        </w:drawing>
+      </w:r>
+    </w:p>
+    <w:p>
+      <w:pPr>
+        <w:pStyle w:val="Didascalia"/>
+        <w:jc w:val="center"/>
+      </w:pPr>
+      <w:r>
+        <w:t xml:space="preserve">Figura </w:t>
+      </w:r>
+      <w:fldSimple w:instr=" SEQ Figura \* ARABIC ">
+        <w:r>
+          <w:rPr>
+            <w:noProof/>
+          </w:rPr>
+          <w:t>5</w:t>
+        </w:r>
+      </w:fldSimple>
+      <w:r>
+        <w:t xml:space="preserve"> - Pagina Ordini vuota</w:t>
+      </w:r>
+    </w:p>
+    <w:p>
+      <w:pPr>
+        <w:rPr>
+          <w:lang w:val="it-IT"/>
+        </w:rPr>
+      </w:pPr>
+    </w:p>
+    <w:p>
+      <w:pPr>
+        <w:pStyle w:val="Titolo1"/>
+        <w:rPr>
+          <w:lang w:val="it-IT"/>
+        </w:rPr>
+      </w:pPr>
+      <w:bookmarkStart w:id="5" w:name="_Toc199335540"/>
+      <w:r>
+        <w:rPr>
+          <w:lang w:val="it-IT"/>
+        </w:rPr>
+        <w:t>Test</w:t>
+      </w:r>
+      <w:bookmarkEnd w:id="5"/>
+    </w:p>
+    <w:p>
+      <w:pPr>
+        <w:tabs>
+          <w:tab w:val="left" w:pos="1490"/>
+        </w:tabs>
+        <w:rPr>
+          <w:lang w:val="it-IT"/>
+        </w:rPr>
+      </w:pPr>
+      <w:r>
+        <w:rPr>
+          <w:lang w:val="it-IT"/>
+        </w:rPr>
+        <w:t>Sono stati effettuati test sui requisiti dell’applicativo. Per maggiori dettagli leggere il capitolo di test nella documentazione principale.</w:t>
+      </w:r>
+    </w:p>
     <w:sectPr>
-      <w:headerReference w:type="default" r:id="rId11"/>
-      <w:footerReference w:type="default" r:id="rId12"/>
+      <w:headerReference w:type="default" r:id="rId15"/>
+      <w:footerReference w:type="default" r:id="rId16"/>
       <w:pgSz w:w="11906" w:h="16838"/>
       <w:pgMar w:top="1417" w:right="1134" w:bottom="1134" w:left="1134" w:header="708" w:footer="708" w:gutter="0"/>
       <w:pgNumType w:start="0"/>
@@ -1064,27 +1860,14 @@
     <w:r>
       <w:t>/</w:t>
     </w:r>
-    <w:r>
-      <w:fldChar w:fldCharType="begin"/>
-    </w:r>
-    <w:r>
-      <w:instrText xml:space="preserve"> NUMPAGES   \* MERGEFORMAT </w:instrText>
-    </w:r>
-    <w:r>
-      <w:fldChar w:fldCharType="separate"/>
-    </w:r>
-    <w:r>
-      <w:rPr>
-        <w:noProof/>
-      </w:rPr>
-      <w:t>2</w:t>
-    </w:r>
-    <w:r>
-      <w:rPr>
-        <w:noProof/>
-      </w:rPr>
-      <w:fldChar w:fldCharType="end"/>
-    </w:r>
+    <w:fldSimple w:instr=" NUMPAGES   \* MERGEFORMAT ">
+      <w:r>
+        <w:rPr>
+          <w:noProof/>
+        </w:rPr>
+        <w:t>2</w:t>
+      </w:r>
+    </w:fldSimple>
   </w:p>
 </w:ftr>
 </file>
@@ -2190,7 +2973,7 @@
 </file>
 
 <file path=customXml/itemProps2.xml><?xml version="1.0" encoding="utf-8"?>
-<ds:datastoreItem xmlns:ds="http://schemas.openxmlformats.org/officeDocument/2006/customXml" ds:itemID="{22701EB0-6D9E-4966-9A72-0C79132150F8}">
+<ds:datastoreItem xmlns:ds="http://schemas.openxmlformats.org/officeDocument/2006/customXml" ds:itemID="{025DD818-9523-4291-BC3D-A4375B681A40}">
   <ds:schemaRefs>
     <ds:schemaRef ds:uri="http://schemas.openxmlformats.org/officeDocument/2006/bibliography"/>
   </ds:schemaRefs>

</xml_diff>